<commit_message>
fix(docx): set tblGrid columnWidths so WPS / mobile renderers respect column layout
docx library does not auto-derive tblGrid from cell tcW widths.
Without explicit columnWidths on Table, tblGrid defaults to 100/100/100 DXA
(~0.5 cm total), which strict renderers (WPS Android/iOS especially) use as
the canonical column structure — collapsing each column to 1 char wide and
wrapping every Chinese character to its own line.

Co-Authored-By: Claude Opus 4.7 (1M context) <noreply@anthropic.com>
</commit_message>
<xml_diff>
--- a/lib/templates/resume-template.docx
+++ b/lib/templates/resume-template.docx
@@ -15,9 +15,9 @@
         </w:tblBorders>
       </w:tblPr>
       <w:tblGrid>
-        <w:gridCol w:w="100"/>
-        <w:gridCol w:w="100"/>
-        <w:gridCol w:w="100"/>
+        <w:gridCol w:w="2837"/>
+        <w:gridCol w:w="4465"/>
+        <w:gridCol w:w="2683"/>
       </w:tblGrid>
       <w:tr>
         <w:tc>
@@ -295,9 +295,9 @@
         </w:tblBorders>
       </w:tblPr>
       <w:tblGrid>
-        <w:gridCol w:w="100"/>
-        <w:gridCol w:w="100"/>
-        <w:gridCol w:w="100"/>
+        <w:gridCol w:w="2602"/>
+        <w:gridCol w:w="4123"/>
+        <w:gridCol w:w="3231"/>
       </w:tblGrid>
       <w:tr>
         <w:tc>

</xml_diff>

<commit_message>
fix: block fallback download + hide empty section titles + compact 2-stat hero
- Hero redesign: drop the giant editorial display number that read too
  loud. Replace with a compact 2-stat headline ("3 处优化已完成   5 道面试题已就绪")
  at uniform body-headline size (22-28px), numbers tinted blue for
  light emphasis without size jump. Both numbers count up.
- Block docx download when report.fallback === true. Skip /prepare,
  swap CTA to "重新填写并重试" so users don't get a docx polluted with
  the fallback mock prose ("（通用建议）label 改成…") rendered as data.
- docx template: wrap each section (title + body) in {#hasXxx}…{/hasXxx}
  conditional via paragraphLoop markers, so empty sections (no work,
  no projects, etc) no longer leak orphan section headers. Verified
  via new scripts/test-minimal-fixture.mjs (8/8 sections hidden when
  fixture only has basics).

Co-Authored-By: Claude Opus 4.7 (1M context) <noreply@anthropic.com>
</commit_message>
<xml_diff>
--- a/lib/templates/resume-template.docx
+++ b/lib/templates/resume-template.docx
@@ -312,6 +312,20 @@
           </w:tcPr>
           <w:p>
             <w:pPr>
+              <w:spacing w:after="0"/>
+            </w:pPr>
+            <w:r>
+              <w:rPr>
+                <w:rFonts w:ascii="Microsoft YaHei" w:cs="Microsoft YaHei" w:eastAsia="Microsoft YaHei" w:hAnsi="Microsoft YaHei"/>
+                <w:color w:val="595959"/>
+                <w:sz w:val="22"/>
+                <w:szCs w:val="22"/>
+              </w:rPr>
+              <w:t xml:space="preserve">{#hasEducation}</w:t>
+            </w:r>
+          </w:p>
+          <w:p>
+            <w:pPr>
               <w:spacing w:after="60" w:before="120"/>
             </w:pPr>
             <w:r>
@@ -501,6 +515,20 @@
               <w:spacing w:after="0"/>
             </w:pPr>
           </w:p>
+          <w:p>
+            <w:pPr>
+              <w:spacing w:after="0"/>
+            </w:pPr>
+            <w:r>
+              <w:rPr>
+                <w:rFonts w:ascii="Microsoft YaHei" w:cs="Microsoft YaHei" w:eastAsia="Microsoft YaHei" w:hAnsi="Microsoft YaHei"/>
+                <w:color w:val="595959"/>
+                <w:sz w:val="22"/>
+                <w:szCs w:val="22"/>
+              </w:rPr>
+              <w:t xml:space="preserve">{/hasEducation}</w:t>
+            </w:r>
+          </w:p>
         </w:tc>
         <w:tc>
           <w:tcPr>
@@ -546,6 +574,20 @@
               <w:right w:val="none" w:sz="0"/>
             </w:tcBorders>
           </w:tcPr>
+          <w:p>
+            <w:pPr>
+              <w:spacing w:after="0"/>
+            </w:pPr>
+            <w:r>
+              <w:rPr>
+                <w:rFonts w:ascii="Microsoft YaHei" w:cs="Microsoft YaHei" w:eastAsia="Microsoft YaHei" w:hAnsi="Microsoft YaHei"/>
+                <w:color w:val="595959"/>
+                <w:sz w:val="22"/>
+                <w:szCs w:val="22"/>
+              </w:rPr>
+              <w:t xml:space="preserve">{#hasSummary}</w:t>
+            </w:r>
+          </w:p>
           <w:p>
             <w:pPr>
               <w:spacing w:after="60" w:before="120"/>
@@ -642,6 +684,20 @@
               <w:spacing w:after="0"/>
             </w:pPr>
           </w:p>
+          <w:p>
+            <w:pPr>
+              <w:spacing w:after="0"/>
+            </w:pPr>
+            <w:r>
+              <w:rPr>
+                <w:rFonts w:ascii="Microsoft YaHei" w:cs="Microsoft YaHei" w:eastAsia="Microsoft YaHei" w:hAnsi="Microsoft YaHei"/>
+                <w:color w:val="595959"/>
+                <w:sz w:val="22"/>
+                <w:szCs w:val="22"/>
+              </w:rPr>
+              <w:t xml:space="preserve">{/hasSummary}</w:t>
+            </w:r>
+          </w:p>
         </w:tc>
         <w:tc>
           <w:tcPr>
@@ -687,6 +743,20 @@
               <w:right w:val="none" w:sz="0"/>
             </w:tcBorders>
           </w:tcPr>
+          <w:p>
+            <w:pPr>
+              <w:spacing w:after="0"/>
+            </w:pPr>
+            <w:r>
+              <w:rPr>
+                <w:rFonts w:ascii="Microsoft YaHei" w:cs="Microsoft YaHei" w:eastAsia="Microsoft YaHei" w:hAnsi="Microsoft YaHei"/>
+                <w:color w:val="595959"/>
+                <w:sz w:val="22"/>
+                <w:szCs w:val="22"/>
+              </w:rPr>
+              <w:t xml:space="preserve">{#hasWork}</w:t>
+            </w:r>
+          </w:p>
           <w:p>
             <w:pPr>
               <w:spacing w:after="60" w:before="120"/>
@@ -924,6 +994,20 @@
               <w:spacing w:after="0"/>
             </w:pPr>
           </w:p>
+          <w:p>
+            <w:pPr>
+              <w:spacing w:after="0"/>
+            </w:pPr>
+            <w:r>
+              <w:rPr>
+                <w:rFonts w:ascii="Microsoft YaHei" w:cs="Microsoft YaHei" w:eastAsia="Microsoft YaHei" w:hAnsi="Microsoft YaHei"/>
+                <w:color w:val="595959"/>
+                <w:sz w:val="22"/>
+                <w:szCs w:val="22"/>
+              </w:rPr>
+              <w:t xml:space="preserve">{/hasWork}</w:t>
+            </w:r>
+          </w:p>
         </w:tc>
         <w:tc>
           <w:tcPr>
@@ -969,6 +1053,20 @@
               <w:right w:val="none" w:sz="0"/>
             </w:tcBorders>
           </w:tcPr>
+          <w:p>
+            <w:pPr>
+              <w:spacing w:after="0"/>
+            </w:pPr>
+            <w:r>
+              <w:rPr>
+                <w:rFonts w:ascii="Microsoft YaHei" w:cs="Microsoft YaHei" w:eastAsia="Microsoft YaHei" w:hAnsi="Microsoft YaHei"/>
+                <w:color w:val="595959"/>
+                <w:sz w:val="22"/>
+                <w:szCs w:val="22"/>
+              </w:rPr>
+              <w:t xml:space="preserve">{#hasProjects}</w:t>
+            </w:r>
+          </w:p>
           <w:p>
             <w:pPr>
               <w:spacing w:after="60" w:before="120"/>
@@ -1220,6 +1318,20 @@
               <w:spacing w:after="0"/>
             </w:pPr>
           </w:p>
+          <w:p>
+            <w:pPr>
+              <w:spacing w:after="0"/>
+            </w:pPr>
+            <w:r>
+              <w:rPr>
+                <w:rFonts w:ascii="Microsoft YaHei" w:cs="Microsoft YaHei" w:eastAsia="Microsoft YaHei" w:hAnsi="Microsoft YaHei"/>
+                <w:color w:val="595959"/>
+                <w:sz w:val="22"/>
+                <w:szCs w:val="22"/>
+              </w:rPr>
+              <w:t xml:space="preserve">{/hasProjects}</w:t>
+            </w:r>
+          </w:p>
         </w:tc>
         <w:tc>
           <w:tcPr>
@@ -1265,6 +1377,20 @@
               <w:right w:val="none" w:sz="0"/>
             </w:tcBorders>
           </w:tcPr>
+          <w:p>
+            <w:pPr>
+              <w:spacing w:after="0"/>
+            </w:pPr>
+            <w:r>
+              <w:rPr>
+                <w:rFonts w:ascii="Microsoft YaHei" w:cs="Microsoft YaHei" w:eastAsia="Microsoft YaHei" w:hAnsi="Microsoft YaHei"/>
+                <w:color w:val="595959"/>
+                <w:sz w:val="22"/>
+                <w:szCs w:val="22"/>
+              </w:rPr>
+              <w:t xml:space="preserve">{#hasSkills}</w:t>
+            </w:r>
+          </w:p>
           <w:p>
             <w:pPr>
               <w:spacing w:after="60" w:before="120"/>
@@ -1387,6 +1513,20 @@
               <w:spacing w:after="0"/>
             </w:pPr>
           </w:p>
+          <w:p>
+            <w:pPr>
+              <w:spacing w:after="0"/>
+            </w:pPr>
+            <w:r>
+              <w:rPr>
+                <w:rFonts w:ascii="Microsoft YaHei" w:cs="Microsoft YaHei" w:eastAsia="Microsoft YaHei" w:hAnsi="Microsoft YaHei"/>
+                <w:color w:val="595959"/>
+                <w:sz w:val="22"/>
+                <w:szCs w:val="22"/>
+              </w:rPr>
+              <w:t xml:space="preserve">{/hasSkills}</w:t>
+            </w:r>
+          </w:p>
         </w:tc>
         <w:tc>
           <w:tcPr>
@@ -1432,6 +1572,20 @@
               <w:right w:val="none" w:sz="0"/>
             </w:tcBorders>
           </w:tcPr>
+          <w:p>
+            <w:pPr>
+              <w:spacing w:after="0"/>
+            </w:pPr>
+            <w:r>
+              <w:rPr>
+                <w:rFonts w:ascii="Microsoft YaHei" w:cs="Microsoft YaHei" w:eastAsia="Microsoft YaHei" w:hAnsi="Microsoft YaHei"/>
+                <w:color w:val="595959"/>
+                <w:sz w:val="22"/>
+                <w:szCs w:val="22"/>
+              </w:rPr>
+              <w:t xml:space="preserve">{#hasLanguages}</w:t>
+            </w:r>
+          </w:p>
           <w:p>
             <w:pPr>
               <w:spacing w:after="60" w:before="120"/>
@@ -1526,6 +1680,20 @@
               <w:spacing w:after="0"/>
             </w:pPr>
           </w:p>
+          <w:p>
+            <w:pPr>
+              <w:spacing w:after="0"/>
+            </w:pPr>
+            <w:r>
+              <w:rPr>
+                <w:rFonts w:ascii="Microsoft YaHei" w:cs="Microsoft YaHei" w:eastAsia="Microsoft YaHei" w:hAnsi="Microsoft YaHei"/>
+                <w:color w:val="595959"/>
+                <w:sz w:val="22"/>
+                <w:szCs w:val="22"/>
+              </w:rPr>
+              <w:t xml:space="preserve">{/hasLanguages}</w:t>
+            </w:r>
+          </w:p>
         </w:tc>
         <w:tc>
           <w:tcPr>
@@ -1571,6 +1739,20 @@
               <w:right w:val="none" w:sz="0"/>
             </w:tcBorders>
           </w:tcPr>
+          <w:p>
+            <w:pPr>
+              <w:spacing w:after="0"/>
+            </w:pPr>
+            <w:r>
+              <w:rPr>
+                <w:rFonts w:ascii="Microsoft YaHei" w:cs="Microsoft YaHei" w:eastAsia="Microsoft YaHei" w:hAnsi="Microsoft YaHei"/>
+                <w:color w:val="595959"/>
+                <w:sz w:val="22"/>
+                <w:szCs w:val="22"/>
+              </w:rPr>
+              <w:t xml:space="preserve">{#hasCertsOrAwards}</w:t>
+            </w:r>
+          </w:p>
           <w:p>
             <w:pPr>
               <w:spacing w:after="60" w:before="120"/>
@@ -1735,6 +1917,20 @@
               <w:spacing w:after="0"/>
             </w:pPr>
           </w:p>
+          <w:p>
+            <w:pPr>
+              <w:spacing w:after="0"/>
+            </w:pPr>
+            <w:r>
+              <w:rPr>
+                <w:rFonts w:ascii="Microsoft YaHei" w:cs="Microsoft YaHei" w:eastAsia="Microsoft YaHei" w:hAnsi="Microsoft YaHei"/>
+                <w:color w:val="595959"/>
+                <w:sz w:val="22"/>
+                <w:szCs w:val="22"/>
+              </w:rPr>
+              <w:t xml:space="preserve">{/hasCertsOrAwards}</w:t>
+            </w:r>
+          </w:p>
         </w:tc>
         <w:tc>
           <w:tcPr>
@@ -1780,6 +1976,20 @@
               <w:right w:val="none" w:sz="0"/>
             </w:tcBorders>
           </w:tcPr>
+          <w:p>
+            <w:pPr>
+              <w:spacing w:after="0"/>
+            </w:pPr>
+            <w:r>
+              <w:rPr>
+                <w:rFonts w:ascii="Microsoft YaHei" w:cs="Microsoft YaHei" w:eastAsia="Microsoft YaHei" w:hAnsi="Microsoft YaHei"/>
+                <w:color w:val="595959"/>
+                <w:sz w:val="22"/>
+                <w:szCs w:val="22"/>
+              </w:rPr>
+              <w:t xml:space="preserve">{#hasVolunteer}</w:t>
+            </w:r>
+          </w:p>
           <w:p>
             <w:pPr>
               <w:spacing w:after="60" w:before="120"/>
@@ -2016,6 +2226,20 @@
             <w:pPr>
               <w:spacing w:after="0"/>
             </w:pPr>
+          </w:p>
+          <w:p>
+            <w:pPr>
+              <w:spacing w:after="0"/>
+            </w:pPr>
+            <w:r>
+              <w:rPr>
+                <w:rFonts w:ascii="Microsoft YaHei" w:cs="Microsoft YaHei" w:eastAsia="Microsoft YaHei" w:hAnsi="Microsoft YaHei"/>
+                <w:color w:val="595959"/>
+                <w:sz w:val="22"/>
+                <w:szCs w:val="22"/>
+              </w:rPr>
+              <w:t xml:space="preserve">{/hasVolunteer}</w:t>
+            </w:r>
           </w:p>
         </w:tc>
         <w:tc>

</xml_diff>

<commit_message>
fix(docx): symmetric page margins (1080/1080) + table widths fitted to content area
User's original 简历模板_0503.docx had asymmetric margins (left=1800, right=866 DXA)
which we inherited. On A4 (11906 DXA) with table widths of 9985/9956, tables
overflowed the right margin by ~745 DXA, pushing visible content far right
with a large empty stripe on the left. Looks unbalanced.

- Page margins: left/right now both 1080 DXA (1.91cm) — symmetric, professional.
- Table column widths: scaled proportionally so total = content area (9746 DXA),
  precisely fitting the new content width with zero overflow.
- Both generate-template.mjs (docxtemplater path) and docx-builder-legacy.ts
  (fallback path) updated together to keep visual parity.

Verified locally: full fixture 25/25, minimal fixture 8/8 (empty sections still
hidden), legacy test ALL PASS.

Co-Authored-By: Claude Opus 4.7 (1M context) <noreply@anthropic.com>
</commit_message>
<xml_diff>
--- a/lib/templates/resume-template.docx
+++ b/lib/templates/resume-template.docx
@@ -4,7 +4,7 @@
   <w:body>
     <w:tbl>
       <w:tblPr>
-        <w:tblW w:type="dxa" w:w="9985"/>
+        <w:tblW w:type="dxa" w:w="9746"/>
         <w:tblBorders>
           <w:top w:val="none" w:sz="0"/>
           <w:left w:val="none" w:sz="0"/>
@@ -15,14 +15,14 @@
         </w:tblBorders>
       </w:tblPr>
       <w:tblGrid>
-        <w:gridCol w:w="2837"/>
-        <w:gridCol w:w="4465"/>
-        <w:gridCol w:w="2683"/>
+        <w:gridCol w:w="2769"/>
+        <w:gridCol w:w="4358"/>
+        <w:gridCol w:w="2619"/>
       </w:tblGrid>
       <w:tr>
         <w:tc>
           <w:tcPr>
-            <w:tcW w:type="dxa" w:w="2837"/>
+            <w:tcW w:type="dxa" w:w="2769"/>
             <w:vMerge w:val="restart"/>
             <w:tcBorders>
               <w:top w:val="none" w:sz="0"/>
@@ -47,7 +47,7 @@
         </w:tc>
         <w:tc>
           <w:tcPr>
-            <w:tcW w:type="dxa" w:w="4465"/>
+            <w:tcW w:type="dxa" w:w="4358"/>
             <w:tcBorders>
               <w:top w:val="none" w:sz="0"/>
               <w:left w:val="none" w:sz="0"/>
@@ -71,7 +71,7 @@
         </w:tc>
         <w:tc>
           <w:tcPr>
-            <w:tcW w:type="dxa" w:w="2683"/>
+            <w:tcW w:type="dxa" w:w="2619"/>
             <w:vMerge w:val="restart"/>
             <w:tcBorders>
               <w:top w:val="none" w:sz="0"/>
@@ -90,7 +90,7 @@
       <w:tr>
         <w:tc>
           <w:tcPr>
-            <w:tcW w:type="dxa" w:w="2837"/>
+            <w:tcW w:type="dxa" w:w="2769"/>
             <w:vMerge w:val="continue"/>
             <w:tcBorders>
               <w:top w:val="none" w:sz="0"/>
@@ -107,7 +107,7 @@
         </w:tc>
         <w:tc>
           <w:tcPr>
-            <w:tcW w:type="dxa" w:w="4465"/>
+            <w:tcW w:type="dxa" w:w="4358"/>
             <w:tcBorders>
               <w:top w:val="none" w:sz="0"/>
               <w:left w:val="none" w:sz="0"/>
@@ -134,7 +134,7 @@
         </w:tc>
         <w:tc>
           <w:tcPr>
-            <w:tcW w:type="dxa" w:w="2683"/>
+            <w:tcW w:type="dxa" w:w="2619"/>
             <w:vMerge w:val="continue"/>
             <w:tcBorders>
               <w:top w:val="none" w:sz="0"/>
@@ -153,7 +153,7 @@
       <w:tr>
         <w:tc>
           <w:tcPr>
-            <w:tcW w:type="dxa" w:w="2837"/>
+            <w:tcW w:type="dxa" w:w="2769"/>
             <w:vMerge w:val="continue"/>
             <w:tcBorders>
               <w:top w:val="none" w:sz="0"/>
@@ -170,7 +170,7 @@
         </w:tc>
         <w:tc>
           <w:tcPr>
-            <w:tcW w:type="dxa" w:w="4465"/>
+            <w:tcW w:type="dxa" w:w="4358"/>
             <w:tcBorders>
               <w:top w:val="none" w:sz="0"/>
               <w:left w:val="none" w:sz="0"/>
@@ -197,7 +197,7 @@
         </w:tc>
         <w:tc>
           <w:tcPr>
-            <w:tcW w:type="dxa" w:w="2683"/>
+            <w:tcW w:type="dxa" w:w="2619"/>
             <w:vMerge w:val="continue"/>
             <w:tcBorders>
               <w:top w:val="none" w:sz="0"/>
@@ -216,7 +216,7 @@
       <w:tr>
         <w:tc>
           <w:tcPr>
-            <w:tcW w:type="dxa" w:w="2837"/>
+            <w:tcW w:type="dxa" w:w="2769"/>
             <w:vMerge w:val="continue"/>
             <w:tcBorders>
               <w:top w:val="none" w:sz="0"/>
@@ -233,7 +233,7 @@
         </w:tc>
         <w:tc>
           <w:tcPr>
-            <w:tcW w:type="dxa" w:w="4465"/>
+            <w:tcW w:type="dxa" w:w="4358"/>
             <w:tcBorders>
               <w:top w:val="none" w:sz="0"/>
               <w:left w:val="none" w:sz="0"/>
@@ -260,7 +260,7 @@
         </w:tc>
         <w:tc>
           <w:tcPr>
-            <w:tcW w:type="dxa" w:w="2683"/>
+            <w:tcW w:type="dxa" w:w="2619"/>
             <w:vMerge w:val="continue"/>
             <w:tcBorders>
               <w:top w:val="none" w:sz="0"/>
@@ -284,7 +284,7 @@
     </w:p>
     <w:tbl>
       <w:tblPr>
-        <w:tblW w:type="dxa" w:w="9956"/>
+        <w:tblW w:type="dxa" w:w="9746"/>
         <w:tblBorders>
           <w:top w:val="none" w:sz="0"/>
           <w:left w:val="none" w:sz="0"/>
@@ -295,14 +295,14 @@
         </w:tblBorders>
       </w:tblPr>
       <w:tblGrid>
-        <w:gridCol w:w="2602"/>
-        <w:gridCol w:w="4123"/>
-        <w:gridCol w:w="3231"/>
+        <w:gridCol w:w="2547"/>
+        <w:gridCol w:w="4036"/>
+        <w:gridCol w:w="3163"/>
       </w:tblGrid>
       <w:tr>
         <w:tc>
           <w:tcPr>
-            <w:tcW w:type="dxa" w:w="2602"/>
+            <w:tcW w:type="dxa" w:w="2547"/>
             <w:tcBorders>
               <w:top w:val="none" w:sz="0"/>
               <w:left w:val="none" w:sz="0"/>
@@ -343,41 +343,41 @@
         </w:tc>
         <w:tc>
           <w:tcPr>
-            <w:tcW w:type="dxa" w:w="4123"/>
-            <w:tcBorders>
-              <w:top w:val="none" w:sz="0"/>
-              <w:left w:val="none" w:sz="0"/>
-              <w:bottom w:val="none" w:sz="0"/>
-              <w:right w:val="none" w:sz="0"/>
-            </w:tcBorders>
-          </w:tcPr>
-          <w:p>
-            <w:pPr>
-              <w:spacing w:after="0"/>
-            </w:pPr>
-          </w:p>
-        </w:tc>
-        <w:tc>
-          <w:tcPr>
-            <w:tcW w:type="dxa" w:w="3231"/>
-            <w:tcBorders>
-              <w:top w:val="none" w:sz="0"/>
-              <w:left w:val="none" w:sz="0"/>
-              <w:bottom w:val="none" w:sz="0"/>
-              <w:right w:val="none" w:sz="0"/>
-            </w:tcBorders>
-          </w:tcPr>
-          <w:p>
-            <w:pPr>
-              <w:spacing w:after="0"/>
-            </w:pPr>
-          </w:p>
-        </w:tc>
-      </w:tr>
-      <w:tr>
-        <w:tc>
-          <w:tcPr>
-            <w:tcW w:type="dxa" w:w="2602"/>
+            <w:tcW w:type="dxa" w:w="4036"/>
+            <w:tcBorders>
+              <w:top w:val="none" w:sz="0"/>
+              <w:left w:val="none" w:sz="0"/>
+              <w:bottom w:val="none" w:sz="0"/>
+              <w:right w:val="none" w:sz="0"/>
+            </w:tcBorders>
+          </w:tcPr>
+          <w:p>
+            <w:pPr>
+              <w:spacing w:after="0"/>
+            </w:pPr>
+          </w:p>
+        </w:tc>
+        <w:tc>
+          <w:tcPr>
+            <w:tcW w:type="dxa" w:w="3163"/>
+            <w:tcBorders>
+              <w:top w:val="none" w:sz="0"/>
+              <w:left w:val="none" w:sz="0"/>
+              <w:bottom w:val="none" w:sz="0"/>
+              <w:right w:val="none" w:sz="0"/>
+            </w:tcBorders>
+          </w:tcPr>
+          <w:p>
+            <w:pPr>
+              <w:spacing w:after="0"/>
+            </w:pPr>
+          </w:p>
+        </w:tc>
+      </w:tr>
+      <w:tr>
+        <w:tc>
+          <w:tcPr>
+            <w:tcW w:type="dxa" w:w="2547"/>
             <w:tcBorders>
               <w:top w:val="none" w:sz="0"/>
               <w:left w:val="none" w:sz="0"/>
@@ -404,7 +404,7 @@
         </w:tc>
         <w:tc>
           <w:tcPr>
-            <w:tcW w:type="dxa" w:w="4123"/>
+            <w:tcW w:type="dxa" w:w="4036"/>
             <w:tcBorders>
               <w:top w:val="none" w:sz="0"/>
               <w:left w:val="none" w:sz="0"/>
@@ -431,7 +431,7 @@
         </w:tc>
         <w:tc>
           <w:tcPr>
-            <w:tcW w:type="dxa" w:w="3231"/>
+            <w:tcW w:type="dxa" w:w="3163"/>
             <w:tcBorders>
               <w:top w:val="none" w:sz="0"/>
               <w:left w:val="none" w:sz="0"/>
@@ -460,7 +460,7 @@
       <w:tr>
         <w:tc>
           <w:tcPr>
-            <w:tcW w:type="dxa" w:w="9956"/>
+            <w:tcW w:type="dxa" w:w="9746"/>
             <w:gridSpan w:val="3"/>
             <w:tcBorders>
               <w:top w:val="none" w:sz="0"/>
@@ -502,7 +502,7 @@
       <w:tr>
         <w:tc>
           <w:tcPr>
-            <w:tcW w:type="dxa" w:w="2602"/>
+            <w:tcW w:type="dxa" w:w="2547"/>
             <w:tcBorders>
               <w:top w:val="none" w:sz="0"/>
               <w:left w:val="none" w:sz="0"/>
@@ -532,41 +532,41 @@
         </w:tc>
         <w:tc>
           <w:tcPr>
-            <w:tcW w:type="dxa" w:w="4123"/>
-            <w:tcBorders>
-              <w:top w:val="none" w:sz="0"/>
-              <w:left w:val="none" w:sz="0"/>
-              <w:bottom w:val="none" w:sz="0"/>
-              <w:right w:val="none" w:sz="0"/>
-            </w:tcBorders>
-          </w:tcPr>
-          <w:p>
-            <w:pPr>
-              <w:spacing w:after="0"/>
-            </w:pPr>
-          </w:p>
-        </w:tc>
-        <w:tc>
-          <w:tcPr>
-            <w:tcW w:type="dxa" w:w="3231"/>
-            <w:tcBorders>
-              <w:top w:val="none" w:sz="0"/>
-              <w:left w:val="none" w:sz="0"/>
-              <w:bottom w:val="none" w:sz="0"/>
-              <w:right w:val="none" w:sz="0"/>
-            </w:tcBorders>
-          </w:tcPr>
-          <w:p>
-            <w:pPr>
-              <w:spacing w:after="0"/>
-            </w:pPr>
-          </w:p>
-        </w:tc>
-      </w:tr>
-      <w:tr>
-        <w:tc>
-          <w:tcPr>
-            <w:tcW w:type="dxa" w:w="2602"/>
+            <w:tcW w:type="dxa" w:w="4036"/>
+            <w:tcBorders>
+              <w:top w:val="none" w:sz="0"/>
+              <w:left w:val="none" w:sz="0"/>
+              <w:bottom w:val="none" w:sz="0"/>
+              <w:right w:val="none" w:sz="0"/>
+            </w:tcBorders>
+          </w:tcPr>
+          <w:p>
+            <w:pPr>
+              <w:spacing w:after="0"/>
+            </w:pPr>
+          </w:p>
+        </w:tc>
+        <w:tc>
+          <w:tcPr>
+            <w:tcW w:type="dxa" w:w="3163"/>
+            <w:tcBorders>
+              <w:top w:val="none" w:sz="0"/>
+              <w:left w:val="none" w:sz="0"/>
+              <w:bottom w:val="none" w:sz="0"/>
+              <w:right w:val="none" w:sz="0"/>
+            </w:tcBorders>
+          </w:tcPr>
+          <w:p>
+            <w:pPr>
+              <w:spacing w:after="0"/>
+            </w:pPr>
+          </w:p>
+        </w:tc>
+      </w:tr>
+      <w:tr>
+        <w:tc>
+          <w:tcPr>
+            <w:tcW w:type="dxa" w:w="2547"/>
             <w:tcBorders>
               <w:top w:val="none" w:sz="0"/>
               <w:left w:val="none" w:sz="0"/>
@@ -607,41 +607,41 @@
         </w:tc>
         <w:tc>
           <w:tcPr>
-            <w:tcW w:type="dxa" w:w="4123"/>
-            <w:tcBorders>
-              <w:top w:val="none" w:sz="0"/>
-              <w:left w:val="none" w:sz="0"/>
-              <w:bottom w:val="none" w:sz="0"/>
-              <w:right w:val="none" w:sz="0"/>
-            </w:tcBorders>
-          </w:tcPr>
-          <w:p>
-            <w:pPr>
-              <w:spacing w:after="0"/>
-            </w:pPr>
-          </w:p>
-        </w:tc>
-        <w:tc>
-          <w:tcPr>
-            <w:tcW w:type="dxa" w:w="3231"/>
-            <w:tcBorders>
-              <w:top w:val="none" w:sz="0"/>
-              <w:left w:val="none" w:sz="0"/>
-              <w:bottom w:val="none" w:sz="0"/>
-              <w:right w:val="none" w:sz="0"/>
-            </w:tcBorders>
-          </w:tcPr>
-          <w:p>
-            <w:pPr>
-              <w:spacing w:after="0"/>
-            </w:pPr>
-          </w:p>
-        </w:tc>
-      </w:tr>
-      <w:tr>
-        <w:tc>
-          <w:tcPr>
-            <w:tcW w:type="dxa" w:w="9956"/>
+            <w:tcW w:type="dxa" w:w="4036"/>
+            <w:tcBorders>
+              <w:top w:val="none" w:sz="0"/>
+              <w:left w:val="none" w:sz="0"/>
+              <w:bottom w:val="none" w:sz="0"/>
+              <w:right w:val="none" w:sz="0"/>
+            </w:tcBorders>
+          </w:tcPr>
+          <w:p>
+            <w:pPr>
+              <w:spacing w:after="0"/>
+            </w:pPr>
+          </w:p>
+        </w:tc>
+        <w:tc>
+          <w:tcPr>
+            <w:tcW w:type="dxa" w:w="3163"/>
+            <w:tcBorders>
+              <w:top w:val="none" w:sz="0"/>
+              <w:left w:val="none" w:sz="0"/>
+              <w:bottom w:val="none" w:sz="0"/>
+              <w:right w:val="none" w:sz="0"/>
+            </w:tcBorders>
+          </w:tcPr>
+          <w:p>
+            <w:pPr>
+              <w:spacing w:after="0"/>
+            </w:pPr>
+          </w:p>
+        </w:tc>
+      </w:tr>
+      <w:tr>
+        <w:tc>
+          <w:tcPr>
+            <w:tcW w:type="dxa" w:w="9746"/>
             <w:gridSpan w:val="3"/>
             <w:tcBorders>
               <w:top w:val="none" w:sz="0"/>
@@ -671,7 +671,7 @@
       <w:tr>
         <w:tc>
           <w:tcPr>
-            <w:tcW w:type="dxa" w:w="2602"/>
+            <w:tcW w:type="dxa" w:w="2547"/>
             <w:tcBorders>
               <w:top w:val="none" w:sz="0"/>
               <w:left w:val="none" w:sz="0"/>
@@ -701,41 +701,41 @@
         </w:tc>
         <w:tc>
           <w:tcPr>
-            <w:tcW w:type="dxa" w:w="4123"/>
-            <w:tcBorders>
-              <w:top w:val="none" w:sz="0"/>
-              <w:left w:val="none" w:sz="0"/>
-              <w:bottom w:val="none" w:sz="0"/>
-              <w:right w:val="none" w:sz="0"/>
-            </w:tcBorders>
-          </w:tcPr>
-          <w:p>
-            <w:pPr>
-              <w:spacing w:after="0"/>
-            </w:pPr>
-          </w:p>
-        </w:tc>
-        <w:tc>
-          <w:tcPr>
-            <w:tcW w:type="dxa" w:w="3231"/>
-            <w:tcBorders>
-              <w:top w:val="none" w:sz="0"/>
-              <w:left w:val="none" w:sz="0"/>
-              <w:bottom w:val="none" w:sz="0"/>
-              <w:right w:val="none" w:sz="0"/>
-            </w:tcBorders>
-          </w:tcPr>
-          <w:p>
-            <w:pPr>
-              <w:spacing w:after="0"/>
-            </w:pPr>
-          </w:p>
-        </w:tc>
-      </w:tr>
-      <w:tr>
-        <w:tc>
-          <w:tcPr>
-            <w:tcW w:type="dxa" w:w="2602"/>
+            <w:tcW w:type="dxa" w:w="4036"/>
+            <w:tcBorders>
+              <w:top w:val="none" w:sz="0"/>
+              <w:left w:val="none" w:sz="0"/>
+              <w:bottom w:val="none" w:sz="0"/>
+              <w:right w:val="none" w:sz="0"/>
+            </w:tcBorders>
+          </w:tcPr>
+          <w:p>
+            <w:pPr>
+              <w:spacing w:after="0"/>
+            </w:pPr>
+          </w:p>
+        </w:tc>
+        <w:tc>
+          <w:tcPr>
+            <w:tcW w:type="dxa" w:w="3163"/>
+            <w:tcBorders>
+              <w:top w:val="none" w:sz="0"/>
+              <w:left w:val="none" w:sz="0"/>
+              <w:bottom w:val="none" w:sz="0"/>
+              <w:right w:val="none" w:sz="0"/>
+            </w:tcBorders>
+          </w:tcPr>
+          <w:p>
+            <w:pPr>
+              <w:spacing w:after="0"/>
+            </w:pPr>
+          </w:p>
+        </w:tc>
+      </w:tr>
+      <w:tr>
+        <w:tc>
+          <w:tcPr>
+            <w:tcW w:type="dxa" w:w="2547"/>
             <w:tcBorders>
               <w:top w:val="none" w:sz="0"/>
               <w:left w:val="none" w:sz="0"/>
@@ -776,41 +776,41 @@
         </w:tc>
         <w:tc>
           <w:tcPr>
-            <w:tcW w:type="dxa" w:w="4123"/>
-            <w:tcBorders>
-              <w:top w:val="none" w:sz="0"/>
-              <w:left w:val="none" w:sz="0"/>
-              <w:bottom w:val="none" w:sz="0"/>
-              <w:right w:val="none" w:sz="0"/>
-            </w:tcBorders>
-          </w:tcPr>
-          <w:p>
-            <w:pPr>
-              <w:spacing w:after="0"/>
-            </w:pPr>
-          </w:p>
-        </w:tc>
-        <w:tc>
-          <w:tcPr>
-            <w:tcW w:type="dxa" w:w="3231"/>
-            <w:tcBorders>
-              <w:top w:val="none" w:sz="0"/>
-              <w:left w:val="none" w:sz="0"/>
-              <w:bottom w:val="none" w:sz="0"/>
-              <w:right w:val="none" w:sz="0"/>
-            </w:tcBorders>
-          </w:tcPr>
-          <w:p>
-            <w:pPr>
-              <w:spacing w:after="0"/>
-            </w:pPr>
-          </w:p>
-        </w:tc>
-      </w:tr>
-      <w:tr>
-        <w:tc>
-          <w:tcPr>
-            <w:tcW w:type="dxa" w:w="2602"/>
+            <w:tcW w:type="dxa" w:w="4036"/>
+            <w:tcBorders>
+              <w:top w:val="none" w:sz="0"/>
+              <w:left w:val="none" w:sz="0"/>
+              <w:bottom w:val="none" w:sz="0"/>
+              <w:right w:val="none" w:sz="0"/>
+            </w:tcBorders>
+          </w:tcPr>
+          <w:p>
+            <w:pPr>
+              <w:spacing w:after="0"/>
+            </w:pPr>
+          </w:p>
+        </w:tc>
+        <w:tc>
+          <w:tcPr>
+            <w:tcW w:type="dxa" w:w="3163"/>
+            <w:tcBorders>
+              <w:top w:val="none" w:sz="0"/>
+              <w:left w:val="none" w:sz="0"/>
+              <w:bottom w:val="none" w:sz="0"/>
+              <w:right w:val="none" w:sz="0"/>
+            </w:tcBorders>
+          </w:tcPr>
+          <w:p>
+            <w:pPr>
+              <w:spacing w:after="0"/>
+            </w:pPr>
+          </w:p>
+        </w:tc>
+      </w:tr>
+      <w:tr>
+        <w:tc>
+          <w:tcPr>
+            <w:tcW w:type="dxa" w:w="2547"/>
             <w:tcBorders>
               <w:top w:val="none" w:sz="0"/>
               <w:left w:val="none" w:sz="0"/>
@@ -837,7 +837,7 @@
         </w:tc>
         <w:tc>
           <w:tcPr>
-            <w:tcW w:type="dxa" w:w="4123"/>
+            <w:tcW w:type="dxa" w:w="4036"/>
             <w:tcBorders>
               <w:top w:val="none" w:sz="0"/>
               <w:left w:val="none" w:sz="0"/>
@@ -864,7 +864,7 @@
         </w:tc>
         <w:tc>
           <w:tcPr>
-            <w:tcW w:type="dxa" w:w="3231"/>
+            <w:tcW w:type="dxa" w:w="3163"/>
             <w:tcBorders>
               <w:top w:val="none" w:sz="0"/>
               <w:left w:val="none" w:sz="0"/>
@@ -893,7 +893,7 @@
       <w:tr>
         <w:tc>
           <w:tcPr>
-            <w:tcW w:type="dxa" w:w="9956"/>
+            <w:tcW w:type="dxa" w:w="9746"/>
             <w:gridSpan w:val="3"/>
             <w:tcBorders>
               <w:top w:val="none" w:sz="0"/>
@@ -981,7 +981,7 @@
       <w:tr>
         <w:tc>
           <w:tcPr>
-            <w:tcW w:type="dxa" w:w="2602"/>
+            <w:tcW w:type="dxa" w:w="2547"/>
             <w:tcBorders>
               <w:top w:val="none" w:sz="0"/>
               <w:left w:val="none" w:sz="0"/>
@@ -1011,41 +1011,41 @@
         </w:tc>
         <w:tc>
           <w:tcPr>
-            <w:tcW w:type="dxa" w:w="4123"/>
-            <w:tcBorders>
-              <w:top w:val="none" w:sz="0"/>
-              <w:left w:val="none" w:sz="0"/>
-              <w:bottom w:val="none" w:sz="0"/>
-              <w:right w:val="none" w:sz="0"/>
-            </w:tcBorders>
-          </w:tcPr>
-          <w:p>
-            <w:pPr>
-              <w:spacing w:after="0"/>
-            </w:pPr>
-          </w:p>
-        </w:tc>
-        <w:tc>
-          <w:tcPr>
-            <w:tcW w:type="dxa" w:w="3231"/>
-            <w:tcBorders>
-              <w:top w:val="none" w:sz="0"/>
-              <w:left w:val="none" w:sz="0"/>
-              <w:bottom w:val="none" w:sz="0"/>
-              <w:right w:val="none" w:sz="0"/>
-            </w:tcBorders>
-          </w:tcPr>
-          <w:p>
-            <w:pPr>
-              <w:spacing w:after="0"/>
-            </w:pPr>
-          </w:p>
-        </w:tc>
-      </w:tr>
-      <w:tr>
-        <w:tc>
-          <w:tcPr>
-            <w:tcW w:type="dxa" w:w="2602"/>
+            <w:tcW w:type="dxa" w:w="4036"/>
+            <w:tcBorders>
+              <w:top w:val="none" w:sz="0"/>
+              <w:left w:val="none" w:sz="0"/>
+              <w:bottom w:val="none" w:sz="0"/>
+              <w:right w:val="none" w:sz="0"/>
+            </w:tcBorders>
+          </w:tcPr>
+          <w:p>
+            <w:pPr>
+              <w:spacing w:after="0"/>
+            </w:pPr>
+          </w:p>
+        </w:tc>
+        <w:tc>
+          <w:tcPr>
+            <w:tcW w:type="dxa" w:w="3163"/>
+            <w:tcBorders>
+              <w:top w:val="none" w:sz="0"/>
+              <w:left w:val="none" w:sz="0"/>
+              <w:bottom w:val="none" w:sz="0"/>
+              <w:right w:val="none" w:sz="0"/>
+            </w:tcBorders>
+          </w:tcPr>
+          <w:p>
+            <w:pPr>
+              <w:spacing w:after="0"/>
+            </w:pPr>
+          </w:p>
+        </w:tc>
+      </w:tr>
+      <w:tr>
+        <w:tc>
+          <w:tcPr>
+            <w:tcW w:type="dxa" w:w="2547"/>
             <w:tcBorders>
               <w:top w:val="none" w:sz="0"/>
               <w:left w:val="none" w:sz="0"/>
@@ -1086,41 +1086,41 @@
         </w:tc>
         <w:tc>
           <w:tcPr>
-            <w:tcW w:type="dxa" w:w="4123"/>
-            <w:tcBorders>
-              <w:top w:val="none" w:sz="0"/>
-              <w:left w:val="none" w:sz="0"/>
-              <w:bottom w:val="none" w:sz="0"/>
-              <w:right w:val="none" w:sz="0"/>
-            </w:tcBorders>
-          </w:tcPr>
-          <w:p>
-            <w:pPr>
-              <w:spacing w:after="0"/>
-            </w:pPr>
-          </w:p>
-        </w:tc>
-        <w:tc>
-          <w:tcPr>
-            <w:tcW w:type="dxa" w:w="3231"/>
-            <w:tcBorders>
-              <w:top w:val="none" w:sz="0"/>
-              <w:left w:val="none" w:sz="0"/>
-              <w:bottom w:val="none" w:sz="0"/>
-              <w:right w:val="none" w:sz="0"/>
-            </w:tcBorders>
-          </w:tcPr>
-          <w:p>
-            <w:pPr>
-              <w:spacing w:after="0"/>
-            </w:pPr>
-          </w:p>
-        </w:tc>
-      </w:tr>
-      <w:tr>
-        <w:tc>
-          <w:tcPr>
-            <w:tcW w:type="dxa" w:w="2602"/>
+            <w:tcW w:type="dxa" w:w="4036"/>
+            <w:tcBorders>
+              <w:top w:val="none" w:sz="0"/>
+              <w:left w:val="none" w:sz="0"/>
+              <w:bottom w:val="none" w:sz="0"/>
+              <w:right w:val="none" w:sz="0"/>
+            </w:tcBorders>
+          </w:tcPr>
+          <w:p>
+            <w:pPr>
+              <w:spacing w:after="0"/>
+            </w:pPr>
+          </w:p>
+        </w:tc>
+        <w:tc>
+          <w:tcPr>
+            <w:tcW w:type="dxa" w:w="3163"/>
+            <w:tcBorders>
+              <w:top w:val="none" w:sz="0"/>
+              <w:left w:val="none" w:sz="0"/>
+              <w:bottom w:val="none" w:sz="0"/>
+              <w:right w:val="none" w:sz="0"/>
+            </w:tcBorders>
+          </w:tcPr>
+          <w:p>
+            <w:pPr>
+              <w:spacing w:after="0"/>
+            </w:pPr>
+          </w:p>
+        </w:tc>
+      </w:tr>
+      <w:tr>
+        <w:tc>
+          <w:tcPr>
+            <w:tcW w:type="dxa" w:w="2547"/>
             <w:tcBorders>
               <w:top w:val="none" w:sz="0"/>
               <w:left w:val="none" w:sz="0"/>
@@ -1147,7 +1147,7 @@
         </w:tc>
         <w:tc>
           <w:tcPr>
-            <w:tcW w:type="dxa" w:w="4123"/>
+            <w:tcW w:type="dxa" w:w="4036"/>
             <w:tcBorders>
               <w:top w:val="none" w:sz="0"/>
               <w:left w:val="none" w:sz="0"/>
@@ -1174,7 +1174,7 @@
         </w:tc>
         <w:tc>
           <w:tcPr>
-            <w:tcW w:type="dxa" w:w="3231"/>
+            <w:tcW w:type="dxa" w:w="3163"/>
             <w:tcBorders>
               <w:top w:val="none" w:sz="0"/>
               <w:left w:val="none" w:sz="0"/>
@@ -1203,7 +1203,7 @@
       <w:tr>
         <w:tc>
           <w:tcPr>
-            <w:tcW w:type="dxa" w:w="9956"/>
+            <w:tcW w:type="dxa" w:w="9746"/>
             <w:gridSpan w:val="3"/>
             <w:tcBorders>
               <w:top w:val="none" w:sz="0"/>
@@ -1305,7 +1305,7 @@
       <w:tr>
         <w:tc>
           <w:tcPr>
-            <w:tcW w:type="dxa" w:w="2602"/>
+            <w:tcW w:type="dxa" w:w="2547"/>
             <w:tcBorders>
               <w:top w:val="none" w:sz="0"/>
               <w:left w:val="none" w:sz="0"/>
@@ -1335,41 +1335,41 @@
         </w:tc>
         <w:tc>
           <w:tcPr>
-            <w:tcW w:type="dxa" w:w="4123"/>
-            <w:tcBorders>
-              <w:top w:val="none" w:sz="0"/>
-              <w:left w:val="none" w:sz="0"/>
-              <w:bottom w:val="none" w:sz="0"/>
-              <w:right w:val="none" w:sz="0"/>
-            </w:tcBorders>
-          </w:tcPr>
-          <w:p>
-            <w:pPr>
-              <w:spacing w:after="0"/>
-            </w:pPr>
-          </w:p>
-        </w:tc>
-        <w:tc>
-          <w:tcPr>
-            <w:tcW w:type="dxa" w:w="3231"/>
-            <w:tcBorders>
-              <w:top w:val="none" w:sz="0"/>
-              <w:left w:val="none" w:sz="0"/>
-              <w:bottom w:val="none" w:sz="0"/>
-              <w:right w:val="none" w:sz="0"/>
-            </w:tcBorders>
-          </w:tcPr>
-          <w:p>
-            <w:pPr>
-              <w:spacing w:after="0"/>
-            </w:pPr>
-          </w:p>
-        </w:tc>
-      </w:tr>
-      <w:tr>
-        <w:tc>
-          <w:tcPr>
-            <w:tcW w:type="dxa" w:w="2602"/>
+            <w:tcW w:type="dxa" w:w="4036"/>
+            <w:tcBorders>
+              <w:top w:val="none" w:sz="0"/>
+              <w:left w:val="none" w:sz="0"/>
+              <w:bottom w:val="none" w:sz="0"/>
+              <w:right w:val="none" w:sz="0"/>
+            </w:tcBorders>
+          </w:tcPr>
+          <w:p>
+            <w:pPr>
+              <w:spacing w:after="0"/>
+            </w:pPr>
+          </w:p>
+        </w:tc>
+        <w:tc>
+          <w:tcPr>
+            <w:tcW w:type="dxa" w:w="3163"/>
+            <w:tcBorders>
+              <w:top w:val="none" w:sz="0"/>
+              <w:left w:val="none" w:sz="0"/>
+              <w:bottom w:val="none" w:sz="0"/>
+              <w:right w:val="none" w:sz="0"/>
+            </w:tcBorders>
+          </w:tcPr>
+          <w:p>
+            <w:pPr>
+              <w:spacing w:after="0"/>
+            </w:pPr>
+          </w:p>
+        </w:tc>
+      </w:tr>
+      <w:tr>
+        <w:tc>
+          <w:tcPr>
+            <w:tcW w:type="dxa" w:w="2547"/>
             <w:tcBorders>
               <w:top w:val="none" w:sz="0"/>
               <w:left w:val="none" w:sz="0"/>
@@ -1410,41 +1410,41 @@
         </w:tc>
         <w:tc>
           <w:tcPr>
-            <w:tcW w:type="dxa" w:w="4123"/>
-            <w:tcBorders>
-              <w:top w:val="none" w:sz="0"/>
-              <w:left w:val="none" w:sz="0"/>
-              <w:bottom w:val="none" w:sz="0"/>
-              <w:right w:val="none" w:sz="0"/>
-            </w:tcBorders>
-          </w:tcPr>
-          <w:p>
-            <w:pPr>
-              <w:spacing w:after="0"/>
-            </w:pPr>
-          </w:p>
-        </w:tc>
-        <w:tc>
-          <w:tcPr>
-            <w:tcW w:type="dxa" w:w="3231"/>
-            <w:tcBorders>
-              <w:top w:val="none" w:sz="0"/>
-              <w:left w:val="none" w:sz="0"/>
-              <w:bottom w:val="none" w:sz="0"/>
-              <w:right w:val="none" w:sz="0"/>
-            </w:tcBorders>
-          </w:tcPr>
-          <w:p>
-            <w:pPr>
-              <w:spacing w:after="0"/>
-            </w:pPr>
-          </w:p>
-        </w:tc>
-      </w:tr>
-      <w:tr>
-        <w:tc>
-          <w:tcPr>
-            <w:tcW w:type="dxa" w:w="9956"/>
+            <w:tcW w:type="dxa" w:w="4036"/>
+            <w:tcBorders>
+              <w:top w:val="none" w:sz="0"/>
+              <w:left w:val="none" w:sz="0"/>
+              <w:bottom w:val="none" w:sz="0"/>
+              <w:right w:val="none" w:sz="0"/>
+            </w:tcBorders>
+          </w:tcPr>
+          <w:p>
+            <w:pPr>
+              <w:spacing w:after="0"/>
+            </w:pPr>
+          </w:p>
+        </w:tc>
+        <w:tc>
+          <w:tcPr>
+            <w:tcW w:type="dxa" w:w="3163"/>
+            <w:tcBorders>
+              <w:top w:val="none" w:sz="0"/>
+              <w:left w:val="none" w:sz="0"/>
+              <w:bottom w:val="none" w:sz="0"/>
+              <w:right w:val="none" w:sz="0"/>
+            </w:tcBorders>
+          </w:tcPr>
+          <w:p>
+            <w:pPr>
+              <w:spacing w:after="0"/>
+            </w:pPr>
+          </w:p>
+        </w:tc>
+      </w:tr>
+      <w:tr>
+        <w:tc>
+          <w:tcPr>
+            <w:tcW w:type="dxa" w:w="9746"/>
             <w:gridSpan w:val="3"/>
             <w:tcBorders>
               <w:top w:val="none" w:sz="0"/>
@@ -1500,7 +1500,7 @@
       <w:tr>
         <w:tc>
           <w:tcPr>
-            <w:tcW w:type="dxa" w:w="2602"/>
+            <w:tcW w:type="dxa" w:w="2547"/>
             <w:tcBorders>
               <w:top w:val="none" w:sz="0"/>
               <w:left w:val="none" w:sz="0"/>
@@ -1530,41 +1530,41 @@
         </w:tc>
         <w:tc>
           <w:tcPr>
-            <w:tcW w:type="dxa" w:w="4123"/>
-            <w:tcBorders>
-              <w:top w:val="none" w:sz="0"/>
-              <w:left w:val="none" w:sz="0"/>
-              <w:bottom w:val="none" w:sz="0"/>
-              <w:right w:val="none" w:sz="0"/>
-            </w:tcBorders>
-          </w:tcPr>
-          <w:p>
-            <w:pPr>
-              <w:spacing w:after="0"/>
-            </w:pPr>
-          </w:p>
-        </w:tc>
-        <w:tc>
-          <w:tcPr>
-            <w:tcW w:type="dxa" w:w="3231"/>
-            <w:tcBorders>
-              <w:top w:val="none" w:sz="0"/>
-              <w:left w:val="none" w:sz="0"/>
-              <w:bottom w:val="none" w:sz="0"/>
-              <w:right w:val="none" w:sz="0"/>
-            </w:tcBorders>
-          </w:tcPr>
-          <w:p>
-            <w:pPr>
-              <w:spacing w:after="0"/>
-            </w:pPr>
-          </w:p>
-        </w:tc>
-      </w:tr>
-      <w:tr>
-        <w:tc>
-          <w:tcPr>
-            <w:tcW w:type="dxa" w:w="2602"/>
+            <w:tcW w:type="dxa" w:w="4036"/>
+            <w:tcBorders>
+              <w:top w:val="none" w:sz="0"/>
+              <w:left w:val="none" w:sz="0"/>
+              <w:bottom w:val="none" w:sz="0"/>
+              <w:right w:val="none" w:sz="0"/>
+            </w:tcBorders>
+          </w:tcPr>
+          <w:p>
+            <w:pPr>
+              <w:spacing w:after="0"/>
+            </w:pPr>
+          </w:p>
+        </w:tc>
+        <w:tc>
+          <w:tcPr>
+            <w:tcW w:type="dxa" w:w="3163"/>
+            <w:tcBorders>
+              <w:top w:val="none" w:sz="0"/>
+              <w:left w:val="none" w:sz="0"/>
+              <w:bottom w:val="none" w:sz="0"/>
+              <w:right w:val="none" w:sz="0"/>
+            </w:tcBorders>
+          </w:tcPr>
+          <w:p>
+            <w:pPr>
+              <w:spacing w:after="0"/>
+            </w:pPr>
+          </w:p>
+        </w:tc>
+      </w:tr>
+      <w:tr>
+        <w:tc>
+          <w:tcPr>
+            <w:tcW w:type="dxa" w:w="2547"/>
             <w:tcBorders>
               <w:top w:val="none" w:sz="0"/>
               <w:left w:val="none" w:sz="0"/>
@@ -1605,41 +1605,41 @@
         </w:tc>
         <w:tc>
           <w:tcPr>
-            <w:tcW w:type="dxa" w:w="4123"/>
-            <w:tcBorders>
-              <w:top w:val="none" w:sz="0"/>
-              <w:left w:val="none" w:sz="0"/>
-              <w:bottom w:val="none" w:sz="0"/>
-              <w:right w:val="none" w:sz="0"/>
-            </w:tcBorders>
-          </w:tcPr>
-          <w:p>
-            <w:pPr>
-              <w:spacing w:after="0"/>
-            </w:pPr>
-          </w:p>
-        </w:tc>
-        <w:tc>
-          <w:tcPr>
-            <w:tcW w:type="dxa" w:w="3231"/>
-            <w:tcBorders>
-              <w:top w:val="none" w:sz="0"/>
-              <w:left w:val="none" w:sz="0"/>
-              <w:bottom w:val="none" w:sz="0"/>
-              <w:right w:val="none" w:sz="0"/>
-            </w:tcBorders>
-          </w:tcPr>
-          <w:p>
-            <w:pPr>
-              <w:spacing w:after="0"/>
-            </w:pPr>
-          </w:p>
-        </w:tc>
-      </w:tr>
-      <w:tr>
-        <w:tc>
-          <w:tcPr>
-            <w:tcW w:type="dxa" w:w="9956"/>
+            <w:tcW w:type="dxa" w:w="4036"/>
+            <w:tcBorders>
+              <w:top w:val="none" w:sz="0"/>
+              <w:left w:val="none" w:sz="0"/>
+              <w:bottom w:val="none" w:sz="0"/>
+              <w:right w:val="none" w:sz="0"/>
+            </w:tcBorders>
+          </w:tcPr>
+          <w:p>
+            <w:pPr>
+              <w:spacing w:after="0"/>
+            </w:pPr>
+          </w:p>
+        </w:tc>
+        <w:tc>
+          <w:tcPr>
+            <w:tcW w:type="dxa" w:w="3163"/>
+            <w:tcBorders>
+              <w:top w:val="none" w:sz="0"/>
+              <w:left w:val="none" w:sz="0"/>
+              <w:bottom w:val="none" w:sz="0"/>
+              <w:right w:val="none" w:sz="0"/>
+            </w:tcBorders>
+          </w:tcPr>
+          <w:p>
+            <w:pPr>
+              <w:spacing w:after="0"/>
+            </w:pPr>
+          </w:p>
+        </w:tc>
+      </w:tr>
+      <w:tr>
+        <w:tc>
+          <w:tcPr>
+            <w:tcW w:type="dxa" w:w="9746"/>
             <w:gridSpan w:val="3"/>
             <w:tcBorders>
               <w:top w:val="none" w:sz="0"/>
@@ -1667,7 +1667,7 @@
       <w:tr>
         <w:tc>
           <w:tcPr>
-            <w:tcW w:type="dxa" w:w="2602"/>
+            <w:tcW w:type="dxa" w:w="2547"/>
             <w:tcBorders>
               <w:top w:val="none" w:sz="0"/>
               <w:left w:val="none" w:sz="0"/>
@@ -1697,41 +1697,41 @@
         </w:tc>
         <w:tc>
           <w:tcPr>
-            <w:tcW w:type="dxa" w:w="4123"/>
-            <w:tcBorders>
-              <w:top w:val="none" w:sz="0"/>
-              <w:left w:val="none" w:sz="0"/>
-              <w:bottom w:val="none" w:sz="0"/>
-              <w:right w:val="none" w:sz="0"/>
-            </w:tcBorders>
-          </w:tcPr>
-          <w:p>
-            <w:pPr>
-              <w:spacing w:after="0"/>
-            </w:pPr>
-          </w:p>
-        </w:tc>
-        <w:tc>
-          <w:tcPr>
-            <w:tcW w:type="dxa" w:w="3231"/>
-            <w:tcBorders>
-              <w:top w:val="none" w:sz="0"/>
-              <w:left w:val="none" w:sz="0"/>
-              <w:bottom w:val="none" w:sz="0"/>
-              <w:right w:val="none" w:sz="0"/>
-            </w:tcBorders>
-          </w:tcPr>
-          <w:p>
-            <w:pPr>
-              <w:spacing w:after="0"/>
-            </w:pPr>
-          </w:p>
-        </w:tc>
-      </w:tr>
-      <w:tr>
-        <w:tc>
-          <w:tcPr>
-            <w:tcW w:type="dxa" w:w="2602"/>
+            <w:tcW w:type="dxa" w:w="4036"/>
+            <w:tcBorders>
+              <w:top w:val="none" w:sz="0"/>
+              <w:left w:val="none" w:sz="0"/>
+              <w:bottom w:val="none" w:sz="0"/>
+              <w:right w:val="none" w:sz="0"/>
+            </w:tcBorders>
+          </w:tcPr>
+          <w:p>
+            <w:pPr>
+              <w:spacing w:after="0"/>
+            </w:pPr>
+          </w:p>
+        </w:tc>
+        <w:tc>
+          <w:tcPr>
+            <w:tcW w:type="dxa" w:w="3163"/>
+            <w:tcBorders>
+              <w:top w:val="none" w:sz="0"/>
+              <w:left w:val="none" w:sz="0"/>
+              <w:bottom w:val="none" w:sz="0"/>
+              <w:right w:val="none" w:sz="0"/>
+            </w:tcBorders>
+          </w:tcPr>
+          <w:p>
+            <w:pPr>
+              <w:spacing w:after="0"/>
+            </w:pPr>
+          </w:p>
+        </w:tc>
+      </w:tr>
+      <w:tr>
+        <w:tc>
+          <w:tcPr>
+            <w:tcW w:type="dxa" w:w="2547"/>
             <w:tcBorders>
               <w:top w:val="none" w:sz="0"/>
               <w:left w:val="none" w:sz="0"/>
@@ -1772,41 +1772,41 @@
         </w:tc>
         <w:tc>
           <w:tcPr>
-            <w:tcW w:type="dxa" w:w="4123"/>
-            <w:tcBorders>
-              <w:top w:val="none" w:sz="0"/>
-              <w:left w:val="none" w:sz="0"/>
-              <w:bottom w:val="none" w:sz="0"/>
-              <w:right w:val="none" w:sz="0"/>
-            </w:tcBorders>
-          </w:tcPr>
-          <w:p>
-            <w:pPr>
-              <w:spacing w:after="0"/>
-            </w:pPr>
-          </w:p>
-        </w:tc>
-        <w:tc>
-          <w:tcPr>
-            <w:tcW w:type="dxa" w:w="3231"/>
-            <w:tcBorders>
-              <w:top w:val="none" w:sz="0"/>
-              <w:left w:val="none" w:sz="0"/>
-              <w:bottom w:val="none" w:sz="0"/>
-              <w:right w:val="none" w:sz="0"/>
-            </w:tcBorders>
-          </w:tcPr>
-          <w:p>
-            <w:pPr>
-              <w:spacing w:after="0"/>
-            </w:pPr>
-          </w:p>
-        </w:tc>
-      </w:tr>
-      <w:tr>
-        <w:tc>
-          <w:tcPr>
-            <w:tcW w:type="dxa" w:w="9956"/>
+            <w:tcW w:type="dxa" w:w="4036"/>
+            <w:tcBorders>
+              <w:top w:val="none" w:sz="0"/>
+              <w:left w:val="none" w:sz="0"/>
+              <w:bottom w:val="none" w:sz="0"/>
+              <w:right w:val="none" w:sz="0"/>
+            </w:tcBorders>
+          </w:tcPr>
+          <w:p>
+            <w:pPr>
+              <w:spacing w:after="0"/>
+            </w:pPr>
+          </w:p>
+        </w:tc>
+        <w:tc>
+          <w:tcPr>
+            <w:tcW w:type="dxa" w:w="3163"/>
+            <w:tcBorders>
+              <w:top w:val="none" w:sz="0"/>
+              <w:left w:val="none" w:sz="0"/>
+              <w:bottom w:val="none" w:sz="0"/>
+              <w:right w:val="none" w:sz="0"/>
+            </w:tcBorders>
+          </w:tcPr>
+          <w:p>
+            <w:pPr>
+              <w:spacing w:after="0"/>
+            </w:pPr>
+          </w:p>
+        </w:tc>
+      </w:tr>
+      <w:tr>
+        <w:tc>
+          <w:tcPr>
+            <w:tcW w:type="dxa" w:w="9746"/>
             <w:gridSpan w:val="3"/>
             <w:tcBorders>
               <w:top w:val="none" w:sz="0"/>
@@ -1904,7 +1904,7 @@
       <w:tr>
         <w:tc>
           <w:tcPr>
-            <w:tcW w:type="dxa" w:w="2602"/>
+            <w:tcW w:type="dxa" w:w="2547"/>
             <w:tcBorders>
               <w:top w:val="none" w:sz="0"/>
               <w:left w:val="none" w:sz="0"/>
@@ -1934,41 +1934,41 @@
         </w:tc>
         <w:tc>
           <w:tcPr>
-            <w:tcW w:type="dxa" w:w="4123"/>
-            <w:tcBorders>
-              <w:top w:val="none" w:sz="0"/>
-              <w:left w:val="none" w:sz="0"/>
-              <w:bottom w:val="none" w:sz="0"/>
-              <w:right w:val="none" w:sz="0"/>
-            </w:tcBorders>
-          </w:tcPr>
-          <w:p>
-            <w:pPr>
-              <w:spacing w:after="0"/>
-            </w:pPr>
-          </w:p>
-        </w:tc>
-        <w:tc>
-          <w:tcPr>
-            <w:tcW w:type="dxa" w:w="3231"/>
-            <w:tcBorders>
-              <w:top w:val="none" w:sz="0"/>
-              <w:left w:val="none" w:sz="0"/>
-              <w:bottom w:val="none" w:sz="0"/>
-              <w:right w:val="none" w:sz="0"/>
-            </w:tcBorders>
-          </w:tcPr>
-          <w:p>
-            <w:pPr>
-              <w:spacing w:after="0"/>
-            </w:pPr>
-          </w:p>
-        </w:tc>
-      </w:tr>
-      <w:tr>
-        <w:tc>
-          <w:tcPr>
-            <w:tcW w:type="dxa" w:w="2602"/>
+            <w:tcW w:type="dxa" w:w="4036"/>
+            <w:tcBorders>
+              <w:top w:val="none" w:sz="0"/>
+              <w:left w:val="none" w:sz="0"/>
+              <w:bottom w:val="none" w:sz="0"/>
+              <w:right w:val="none" w:sz="0"/>
+            </w:tcBorders>
+          </w:tcPr>
+          <w:p>
+            <w:pPr>
+              <w:spacing w:after="0"/>
+            </w:pPr>
+          </w:p>
+        </w:tc>
+        <w:tc>
+          <w:tcPr>
+            <w:tcW w:type="dxa" w:w="3163"/>
+            <w:tcBorders>
+              <w:top w:val="none" w:sz="0"/>
+              <w:left w:val="none" w:sz="0"/>
+              <w:bottom w:val="none" w:sz="0"/>
+              <w:right w:val="none" w:sz="0"/>
+            </w:tcBorders>
+          </w:tcPr>
+          <w:p>
+            <w:pPr>
+              <w:spacing w:after="0"/>
+            </w:pPr>
+          </w:p>
+        </w:tc>
+      </w:tr>
+      <w:tr>
+        <w:tc>
+          <w:tcPr>
+            <w:tcW w:type="dxa" w:w="2547"/>
             <w:tcBorders>
               <w:top w:val="none" w:sz="0"/>
               <w:left w:val="none" w:sz="0"/>
@@ -2009,41 +2009,41 @@
         </w:tc>
         <w:tc>
           <w:tcPr>
-            <w:tcW w:type="dxa" w:w="4123"/>
-            <w:tcBorders>
-              <w:top w:val="none" w:sz="0"/>
-              <w:left w:val="none" w:sz="0"/>
-              <w:bottom w:val="none" w:sz="0"/>
-              <w:right w:val="none" w:sz="0"/>
-            </w:tcBorders>
-          </w:tcPr>
-          <w:p>
-            <w:pPr>
-              <w:spacing w:after="0"/>
-            </w:pPr>
-          </w:p>
-        </w:tc>
-        <w:tc>
-          <w:tcPr>
-            <w:tcW w:type="dxa" w:w="3231"/>
-            <w:tcBorders>
-              <w:top w:val="none" w:sz="0"/>
-              <w:left w:val="none" w:sz="0"/>
-              <w:bottom w:val="none" w:sz="0"/>
-              <w:right w:val="none" w:sz="0"/>
-            </w:tcBorders>
-          </w:tcPr>
-          <w:p>
-            <w:pPr>
-              <w:spacing w:after="0"/>
-            </w:pPr>
-          </w:p>
-        </w:tc>
-      </w:tr>
-      <w:tr>
-        <w:tc>
-          <w:tcPr>
-            <w:tcW w:type="dxa" w:w="2602"/>
+            <w:tcW w:type="dxa" w:w="4036"/>
+            <w:tcBorders>
+              <w:top w:val="none" w:sz="0"/>
+              <w:left w:val="none" w:sz="0"/>
+              <w:bottom w:val="none" w:sz="0"/>
+              <w:right w:val="none" w:sz="0"/>
+            </w:tcBorders>
+          </w:tcPr>
+          <w:p>
+            <w:pPr>
+              <w:spacing w:after="0"/>
+            </w:pPr>
+          </w:p>
+        </w:tc>
+        <w:tc>
+          <w:tcPr>
+            <w:tcW w:type="dxa" w:w="3163"/>
+            <w:tcBorders>
+              <w:top w:val="none" w:sz="0"/>
+              <w:left w:val="none" w:sz="0"/>
+              <w:bottom w:val="none" w:sz="0"/>
+              <w:right w:val="none" w:sz="0"/>
+            </w:tcBorders>
+          </w:tcPr>
+          <w:p>
+            <w:pPr>
+              <w:spacing w:after="0"/>
+            </w:pPr>
+          </w:p>
+        </w:tc>
+      </w:tr>
+      <w:tr>
+        <w:tc>
+          <w:tcPr>
+            <w:tcW w:type="dxa" w:w="2547"/>
             <w:tcBorders>
               <w:top w:val="none" w:sz="0"/>
               <w:left w:val="none" w:sz="0"/>
@@ -2070,7 +2070,7 @@
         </w:tc>
         <w:tc>
           <w:tcPr>
-            <w:tcW w:type="dxa" w:w="4123"/>
+            <w:tcW w:type="dxa" w:w="4036"/>
             <w:tcBorders>
               <w:top w:val="none" w:sz="0"/>
               <w:left w:val="none" w:sz="0"/>
@@ -2097,7 +2097,7 @@
         </w:tc>
         <w:tc>
           <w:tcPr>
-            <w:tcW w:type="dxa" w:w="3231"/>
+            <w:tcW w:type="dxa" w:w="3163"/>
             <w:tcBorders>
               <w:top w:val="none" w:sz="0"/>
               <w:left w:val="none" w:sz="0"/>
@@ -2126,7 +2126,7 @@
       <w:tr>
         <w:tc>
           <w:tcPr>
-            <w:tcW w:type="dxa" w:w="9956"/>
+            <w:tcW w:type="dxa" w:w="9746"/>
             <w:gridSpan w:val="3"/>
             <w:tcBorders>
               <w:top w:val="none" w:sz="0"/>
@@ -2214,7 +2214,7 @@
       <w:tr>
         <w:tc>
           <w:tcPr>
-            <w:tcW w:type="dxa" w:w="2602"/>
+            <w:tcW w:type="dxa" w:w="2547"/>
             <w:tcBorders>
               <w:top w:val="none" w:sz="0"/>
               <w:left w:val="none" w:sz="0"/>
@@ -2244,23 +2244,23 @@
         </w:tc>
         <w:tc>
           <w:tcPr>
-            <w:tcW w:type="dxa" w:w="4123"/>
-            <w:tcBorders>
-              <w:top w:val="none" w:sz="0"/>
-              <w:left w:val="none" w:sz="0"/>
-              <w:bottom w:val="none" w:sz="0"/>
-              <w:right w:val="none" w:sz="0"/>
-            </w:tcBorders>
-          </w:tcPr>
-          <w:p>
-            <w:pPr>
-              <w:spacing w:after="0"/>
-            </w:pPr>
-          </w:p>
-        </w:tc>
-        <w:tc>
-          <w:tcPr>
-            <w:tcW w:type="dxa" w:w="3231"/>
+            <w:tcW w:type="dxa" w:w="4036"/>
+            <w:tcBorders>
+              <w:top w:val="none" w:sz="0"/>
+              <w:left w:val="none" w:sz="0"/>
+              <w:bottom w:val="none" w:sz="0"/>
+              <w:right w:val="none" w:sz="0"/>
+            </w:tcBorders>
+          </w:tcPr>
+          <w:p>
+            <w:pPr>
+              <w:spacing w:after="0"/>
+            </w:pPr>
+          </w:p>
+        </w:tc>
+        <w:tc>
+          <w:tcPr>
+            <w:tcW w:type="dxa" w:w="3163"/>
             <w:tcBorders>
               <w:top w:val="none" w:sz="0"/>
               <w:left w:val="none" w:sz="0"/>
@@ -2278,7 +2278,7 @@
     </w:tbl>
     <w:sectPr>
       <w:pgSz w:w="11906" w:h="16838" w:orient="portrait"/>
-      <w:pgMar w:top="1440" w:right="866" w:bottom="1440" w:left="1800" w:header="708" w:footer="708" w:gutter="0"/>
+      <w:pgMar w:top="1440" w:right="1080" w:bottom="1440" w:left="1080" w:header="708" w:footer="708" w:gutter="0"/>
       <w:pgNumType/>
       <w:docGrid w:linePitch="360"/>
     </w:sectPr>

</xml_diff>